<commit_message>
Revise pack to 400 V (V1); resolve thermal core to CO2 self-build; add sourcing tracker + build process
</commit_message>
<xml_diff>
--- a/02_Systems_Architecture/House_BUS_Systems_Architecture.docx
+++ b/02_Systems_Architecture/House_BUS_Systems_Architecture.docx
@@ -133,7 +133,7 @@
         <w:spacing w:after="120"/>
       </w:pPr>
       <w:r>
-        <w:t xml:space="preserve">Two architectural facts are now locked and shape everything below. First, there is no separate house battery: a single ~300 kWh structural sodium-ion pack forms the floor of the bus, drives the vehicle, and runs the home, stepped from 800 V down to a 48 V house rail, with a software drive-reserve floor that house loads can never deplete. Second, the heat-reuse loop is strictly grade-matched — low-grade recovered heat does low-grade jobs, while high-grade loads stay electric. The diagram shows the whole platform.</w:t>
+        <w:t xml:space="preserve">Two architectural facts are now locked and shape everything below. First, there is no separate house battery: a single ~300 kWh structural sodium-ion pack forms the floor of the bus, drives the vehicle, and runs the home, stepped from 400 V (V1; 800 V is the future target) down to a 48 V house rail, with a software drive-reserve floor that house loads can never deplete. Second, the heat-reuse loop is strictly grade-matched — low-grade recovered heat does low-grade jobs, while high-grade loads stay electric. The diagram shows the whole platform.</w:t>
       </w:r>
     </w:p>
     <w:p>
@@ -263,7 +263,7 @@
         <w:t xml:space="preserve">Structural pack + DC bus. </w:t>
       </w:r>
       <w:r>
-        <w:t xml:space="preserve">The single ~300 kWh sodium pack feeds an 800 V bus (traction, large thermal loads) and a 48 V house rail via DC-DC, replenished by solar, the diesel CHP, and shore/charge.</w:t>
+        <w:t xml:space="preserve">The single ~300 kWh sodium pack feeds a 400 V bus (traction, large thermal loads) and a 48 V house rail via DC-DC, replenished by solar, the diesel CHP, and shore/charge.</w:t>
       </w:r>
     </w:p>
     <w:p>
@@ -279,7 +279,7 @@
         <w:spacing w:after="120"/>
       </w:pPr>
       <w:r>
-        <w:t xml:space="preserve">The defining choice is that the traction battery is the house battery. A single structural sodium-ion pack (~300 kWh, 800 V class, forming the bus floor) is the only energy store. This removes a second lithium bank entirely, but it makes one rule non-negotiable: a software drive-reserve floor must always hold back enough energy to actually move the dwelling, so house loads can never strand it.</w:t>
+        <w:t xml:space="preserve">The defining choice is that the traction battery is the house battery. A single structural sodium-ion pack (~300 kWh, 400 V class (V1; 800 V future), forming the bus floor) is the only energy store. This removes a second lithium bank entirely, but it makes one rule non-negotiable: a software drive-reserve floor must always hold back enough energy to actually move the dwelling, so house loads can never strand it.</w:t>
       </w:r>
     </w:p>
     <w:tbl>
@@ -499,7 +499,7 @@
                 <w:sz w:val="20"/>
                 <w:szCs w:val="20"/>
               </w:rPr>
-              <w:t xml:space="preserve">~300 kWh, 800 V class; sodium by build time at similar weight to today's LFP; modular for later swap</w:t>
+              <w:t xml:space="preserve">~300 kWh, 400 V class (V1; 800 V future); sodium by build time at similar weight to today's LFP; modular for later swap</w:t>
             </w:r>
           </w:p>
         </w:tc>
@@ -635,7 +635,7 @@
                 <w:sz w:val="20"/>
                 <w:szCs w:val="20"/>
               </w:rPr>
-              <w:t xml:space="preserve">800 V → 48 V DC-DC</w:t>
+              <w:t xml:space="preserve">400 V → 48 V DC-DC</w:t>
             </w:r>
           </w:p>
         </w:tc>
@@ -701,7 +701,7 @@
                 <w:sz w:val="20"/>
                 <w:szCs w:val="20"/>
               </w:rPr>
-              <w:t xml:space="preserve">5–10 kW, &gt;95% efficient; 800 V kept clear of wet zones (SELV 48 V discipline)</w:t>
+              <w:t xml:space="preserve">5–10 kW, &gt;95% efficient; 400 V kept clear of wet zones (SELV 48 V discipline)</w:t>
             </w:r>
           </w:p>
         </w:tc>
@@ -3881,7 +3881,7 @@
                 <w:sz w:val="20"/>
                 <w:szCs w:val="20"/>
               </w:rPr>
-              <w:t xml:space="preserve">800 V -&gt; 48 V DC-DC; drive-reserve floor</w:t>
+              <w:t xml:space="preserve">400 V -&gt; 48 V DC-DC; drive-reserve floor</w:t>
             </w:r>
           </w:p>
         </w:tc>

</xml_diff>